<commit_message>
business: fix 'wins and losses' — honest perf matrix framing
Surface 16x ops reduction (profiling path, 4 vs 64 ops) as the real
signal. Remove misleading 'wins and losses' phrasing from all pitch
materials and replace with accurate description of cycle overhead vs
ops reduction.

Also regenerate ATOMiK_Investor_Deck.pptx and ATOMiK_Aggie_Angel_Deck.pptx.

Co-Authored-By: Claude Sonnet 4.6 (1M context) <noreply@anthropic.com>
</commit_message>
<xml_diff>
--- a/business/for_codex/01_pitch_materials/ATOMiK_Business_Plan.docx
+++ b/business/for_codex/01_pitch_materials/ATOMiK_Business_Plan.docx
@@ -26,6 +26,34 @@
     </w:p>
     <w:p/>
     <w:p>
+      <w:r>
+        <w:rPr>
+          <w:b/>
+          <w:sz w:val="18"/>
+        </w:rPr>
+        <w:t>CONTROLLED DILIGENCE - NOT FRONT-OF-ROOM - MAY 2026 - Founder-prepared; counsel/CFO review pending where applicable.</w:t>
+      </w:r>
+    </w:p>
+    <w:p>
+      <w:pPr>
+        <w:pStyle w:val="Heading1"/>
+      </w:pPr>
+      <w:r>
+        <w:rPr>
+          <w:color w:val="070B12"/>
+        </w:rPr>
+        <w:t>How To Read This Document</w:t>
+      </w:r>
+    </w:p>
+    <w:p>
+      <w:r>
+        <w:rPr>
+          <w:sz w:val="19"/>
+        </w:rPr>
+        <w:t>This plan is intended for controlled investor diligence after the initial pitch. It does not replace legal, financial, or technical diligence. Market figures are context only. Current proof claims are artifact-bound. Customer, revenue, battery, heat, water, cooling, and footprint outcomes require workload-specific measurement.</w:t>
+      </w:r>
+    </w:p>
+    <w:p>
       <w:pPr>
         <w:pStyle w:val="Heading1"/>
       </w:pPr>
@@ -41,7 +69,7 @@
         <w:rPr>
           <w:sz w:val="22"/>
         </w:rPr>
-        <w:t>ATOMiK is a state-aware compute architecture startup developing a hardware/IP primitive that reduces wasted state movement in constrained edge, embedded, and AI systems. The company is pre-revenue, pre-seed stage, hardware-validated on FPGA, and raising $2.0M to fund measured customer proof and IP diligence.</w:t>
+        <w:t>ATOMiK is a state-aware compute architecture startup developing a hardware/IP primitive for reducing wasted state movement where workload evidence supports it. The company is pre-revenue, pre-seed stage, hardware-validated on FPGA for selected proof paths, and raising $2.0M to fund measured customer proof and IP diligence.</w:t>
       </w:r>
     </w:p>
     <w:p>
@@ -49,7 +77,7 @@
         <w:rPr>
           <w:sz w:val="22"/>
         </w:rPr>
-        <w:t>Incorporation status: LLC/C-Corp formation in progress. See data room for current entity documentation.</w:t>
+        <w:t>Entity status: current operating entity is Rockwell Industries, LLC; intended VC-ready Delaware C-Corp structure remains counsel-pending before institutional close. See data room for current legal-status documentation.</w:t>
       </w:r>
     </w:p>
     <w:p>
@@ -68,7 +96,7 @@
         <w:rPr>
           <w:sz w:val="22"/>
         </w:rPr>
-        <w:t>Every constrained system in the world — edge devices, embedded controllers, AI inference systems, remote industrial equipment — pays a hidden tax on state it hasn't changed. The system scans it, compares it, copies it, moves it, syncs it. Every tick. Even when nothing meaningful changed.</w:t>
+        <w:t>Many constrained systems - edge devices, embedded controllers, AI-at-the-edge systems, and remote industrial equipment - pay a hidden tax on state paths that repeatedly scan, compare, copy, move, sync, replay, or rebuild state even when only a compact change matters.</w:t>
       </w:r>
     </w:p>
     <w:p>
@@ -87,7 +115,7 @@
         <w:rPr>
           <w:sz w:val="21"/>
         </w:rPr>
-        <w:t>Shortened battery life in edge and IoT devices</w:t>
+        <w:t>Battery pressure in edge and IoT devices</w:t>
       </w:r>
     </w:p>
     <w:p>
@@ -98,7 +126,7 @@
         <w:rPr>
           <w:sz w:val="21"/>
         </w:rPr>
-        <w:t>Unnecessary heat in sealed or fanless systems</w:t>
+        <w:t>Thermal pressure in sealed or fanless systems</w:t>
       </w:r>
     </w:p>
     <w:p>
@@ -109,7 +137,7 @@
         <w:rPr>
           <w:sz w:val="21"/>
         </w:rPr>
-        <w:t>Wasted bandwidth over intermittent or expensive links</w:t>
+        <w:t>Bandwidth pressure over intermittent or expensive links</w:t>
       </w:r>
     </w:p>
     <w:p>
@@ -139,7 +167,15 @@
         <w:rPr>
           <w:sz w:val="18"/>
         </w:rPr>
-        <w:t>Market scale: Data-center energy 415→945 TWh by 2030 (IEA). U.S. data centers 176→325–580 TWh by 2028 (LBNL). 66B liters direct cooling water (2023 U.S.). Semiconductor market $772B (2025).</w:t>
+        <w:t>Market scale: Data-center energy 415-&gt;945 TWh by 2030 (IEA). U.S. data centers 176-&gt;325-580 TWh by 2028 (LBNL). 66B liters direct cooling water (2023 U.S.). Semiconductor sales were $791.7B in 2025 and Q1 2026 reached $298.5B (SIA).</w:t>
+      </w:r>
+    </w:p>
+    <w:p>
+      <w:r>
+        <w:rPr>
+          <w:sz w:val="15"/>
+        </w:rPr>
+        <w:t>Sources: IEA Energy and AI executive summary (https://www.iea.org/reports/energy-and-ai/executive-summary); LBNL 2024 United States Data Center Energy Usage Report (https://eta-publications.lbl.gov/sites/default/files/2024-12/lbnl-2024-united-states-data-center-energy-usage-report.pdf); SIA 2025 global sales release (https://www.semiconductors.org/global-annual-semiconductor-sales-increase-25-6-to-791-7-billion-in-2025/); SIA Q1 2026 sales release (https://www.semiconductors.org/global-semiconductor-sales-increase-25-from-q4-2025-to-q1-2026/). These figures are market context only, not ATOMiK savings claims.</w:t>
       </w:r>
     </w:p>
     <w:p>
@@ -174,7 +210,7 @@
         <w:rPr>
           <w:sz w:val="22"/>
         </w:rPr>
-        <w:t>The primitive is self-inverse (applying a delta twice returns to original state), commutative (order doesn't matter), associative (can be parallelized), and identity-preserving (XOR with zero is a no-op). These algebraic properties have been formally proven and hardware-validated.</w:t>
+        <w:t>The primitive is self-inverse, commutative, associative, and identity-preserving under XOR. Formal proof work exists in the repo, and selected algebraic checks have passed through the Linux userspace-to-FPGA validation path.</w:t>
       </w:r>
     </w:p>
     <w:p>
@@ -182,7 +218,7 @@
         <w:rPr>
           <w:sz w:val="22"/>
         </w:rPr>
-        <w:t>What this means for customers: instead of moving, scanning, syncing, or rebuilding full state — move only what changed. Track only meaningful change. Reduce redundant state movement at the source.</w:t>
+        <w:t>What this means for customers: evaluate whether a constrained workload can move, scan, sync, or rebuild less state while preserving correctness.</w:t>
       </w:r>
     </w:p>
     <w:p>
@@ -201,7 +237,7 @@
         <w:rPr>
           <w:sz w:val="22"/>
         </w:rPr>
-        <w:t>Hardware-validated proof exists. The following is accurate as of May 2026:</w:t>
+        <w:t>Hardware-validated proof exists for specific artifacts. The following is accurate as of May 2026:</w:t>
       </w:r>
     </w:p>
     <w:p>
@@ -245,7 +281,7 @@
         <w:rPr>
           <w:sz w:val="21"/>
         </w:rPr>
-        <w:t>Formal proofs: algebraic properties proved in Lean4 (SOFTWARE_VALIDATED)</w:t>
+        <w:t>Formal proof foundation: FORMAL_PROOF where directly audited; otherwise proof work present. Avoid public proof counts until reconciled across repo, site, deck, and proof packet.</w:t>
       </w:r>
     </w:p>
     <w:p>
@@ -256,7 +292,7 @@
         <w:rPr>
           <w:sz w:val="21"/>
         </w:rPr>
-        <w:t>SD boot artifacts: BOOT.bin and bitstream exist; standalone SD boot in final validation (BUILD_ARTIFACT)</w:t>
+        <w:t>SD boot artifacts: BOOT.bin and bitstream exist; standalone power-on boot remains gated (BUILD_ARTIFACT)</w:t>
       </w:r>
     </w:p>
     <w:p>
@@ -449,7 +485,7 @@
         <w:rPr>
           <w:sz w:val="22"/>
         </w:rPr>
-        <w:t>ATOMiK is an IP company, not a product company. Revenue path:</w:t>
+        <w:t>ATOMiK's near-term monetization is evaluation- and IP-led, not mass product manufacturing. Revenue path:</w:t>
       </w:r>
     </w:p>
     <w:p>
@@ -493,7 +529,7 @@
         <w:rPr>
           <w:sz w:val="21"/>
         </w:rPr>
-        <w:t>Strategic acquisition — acquired by semiconductor or platform company needing this for their edge stack</w:t>
+        <w:t>Strategic optionality — licensing, integration partnership, or platform partnership if proof and IP diligence justify it</w:t>
       </w:r>
     </w:p>
     <w:p>
@@ -600,7 +636,7 @@
               <w:rPr>
                 <w:sz w:val="19"/>
               </w:rPr>
-              <w:t>Von Neumann CPUs</w:t>
+              <w:t>General CPUs</w:t>
             </w:r>
           </w:p>
         </w:tc>
@@ -613,7 +649,7 @@
               <w:rPr>
                 <w:sz w:val="19"/>
               </w:rPr>
-              <w:t>Process full state every cycle. ATOMiK: process change.</w:t>
+              <w:t>Flexible execution. ATOMiK differs by evaluating whether the workload can be represented as reference state plus accumulated change.</w:t>
             </w:r>
           </w:p>
         </w:tc>
@@ -641,7 +677,7 @@
               <w:rPr>
                 <w:sz w:val="19"/>
               </w:rPr>
-              <w:t>Reduce stored size. ATOMiK: reduce movement frequency.</w:t>
+              <w:t>Reduces representation size. ATOMiK targets when state movement or repeated reconstruction can be avoided.</w:t>
             </w:r>
           </w:p>
         </w:tc>
@@ -669,7 +705,7 @@
               <w:rPr>
                 <w:sz w:val="19"/>
               </w:rPr>
-              <w:t>Cache hot data. ATOMiK: accumulate delta; avoid unnecessary reads.</w:t>
+              <w:t>Keeps hot data nearby. ATOMiK targets meaningful change and epoch boundaries.</w:t>
             </w:r>
           </w:p>
         </w:tc>
@@ -684,7 +720,7 @@
               <w:rPr>
                 <w:sz w:val="19"/>
               </w:rPr>
-              <w:t>Custom ASICs</w:t>
+              <w:t>Custom accelerators</w:t>
             </w:r>
           </w:p>
         </w:tc>
@@ -697,7 +733,7 @@
               <w:rPr>
                 <w:sz w:val="19"/>
               </w:rPr>
-              <w:t>Optimize known workload. ATOMiK: architecture-level primitive applicable across workloads.</w:t>
+              <w:t>Optimize known kernels. ATOMiK is an architecture primitive that still requires workload-specific proof.</w:t>
             </w:r>
           </w:p>
         </w:tc>
@@ -720,7 +756,7 @@
         <w:rPr>
           <w:sz w:val="22"/>
         </w:rPr>
-        <w:t>Provisional patent filed (see data room: 03_intellectual_property). Patent conversion and prior-art review funded in pre-seed budget. Trade secret protections documented. Pre-seed allocates $300K to IP/legal.</w:t>
+        <w:t>Provisional patent filed (see data room: 03_intellectual_property). Patent conversion, prior-art review, trade-secret controls, and final IP assignment chain remain counsel-review workstreams. Pre-seed allocates $300K to IP/legal.</w:t>
       </w:r>
     </w:p>
     <w:p>
@@ -830,7 +866,7 @@
               <w:rPr>
                 <w:sz w:val="19"/>
               </w:rPr>
-              <w:t>Post-money SAFE — final terms require CFO/counsel</w:t>
+              <w:t>Planned SAFE — final terms require CFO/counsel</w:t>
             </w:r>
           </w:p>
         </w:tc>
@@ -1135,7 +1171,7 @@
               <w:rPr>
                 <w:sz w:val="19"/>
               </w:rPr>
-              <w:t>First evaluation conversation in progress. Budget dedicated to proof.</w:t>
+              <w:t>Budget dedicated to proof reviews, technical evaluations, and design-partner outreach.</w:t>
             </w:r>
           </w:p>
         </w:tc>
@@ -1247,7 +1283,7 @@
               <w:rPr>
                 <w:sz w:val="19"/>
               </w:rPr>
-              <w:t>Build IP and proof quickly. Strategic conversations now.</w:t>
+              <w:t>Build IP and proof quickly. Pursue partner conversations without implying a promised exit.</w:t>
             </w:r>
           </w:p>
         </w:tc>

</xml_diff>